<commit_message>
Prepare technical assessment for Midas Health Services
</commit_message>
<xml_diff>
--- a/Documentation/API Test Report - WorkForcePro.docx
+++ b/Documentation/API Test Report - WorkForcePro.docx
@@ -52,7 +52,7 @@
           <w:szCs w:val="28"/>
           <w:rtl w:val="0"/>
         </w:rPr>
-        <w:t xml:space="preserve">Objective</w:t>
+        <w:t xml:space="preserve">Objective:</w:t>
       </w:r>
     </w:p>
     <w:p>
@@ -87,7 +87,7 @@
           <w:szCs w:val="28"/>
           <w:rtl w:val="0"/>
         </w:rPr>
-        <w:t xml:space="preserve">Scope</w:t>
+        <w:t xml:space="preserve">Scope:</w:t>
       </w:r>
     </w:p>
     <w:p>
@@ -175,7 +175,7 @@
           <w:szCs w:val="28"/>
           <w:rtl w:val="0"/>
         </w:rPr>
-        <w:t xml:space="preserve">Assumptions</w:t>
+        <w:t xml:space="preserve">Assumptions:</w:t>
       </w:r>
     </w:p>
     <w:p>
@@ -249,7 +249,7 @@
           <w:szCs w:val="28"/>
           <w:rtl w:val="0"/>
         </w:rPr>
-        <w:t xml:space="preserve">Test Coverage</w:t>
+        <w:t xml:space="preserve">Test Coverage:</w:t>
       </w:r>
     </w:p>
     <w:p>
@@ -351,7 +351,7 @@
           <w:szCs w:val="28"/>
           <w:rtl w:val="0"/>
         </w:rPr>
-        <w:t xml:space="preserve">Findings</w:t>
+        <w:t xml:space="preserve">Findings:</w:t>
       </w:r>
     </w:p>
     <w:p>

</xml_diff>